<commit_message>
Add RAG Chatbot architecture to Section 1 of report
</commit_message>
<xml_diff>
--- a/Bao_Cao_Thiet_Ke_He_Thong_Dat_Phong.docx
+++ b/Bao_Cao_Thiet_Ke_He_Thong_Dat_Phong.docx
@@ -322,6 +322,23 @@
           <w:szCs w:val="20"/>
         </w:rPr>
         <w:t xml:space="preserve">1.3 Vai Trò Người Dùng</w:t>
+      </w:r>
+    </w:p>
+    <w:p>
+      <w:pPr>
+        <w:spacing w:after="30" w:before="30" w:line="260"/>
+        <w:ind w:left="360"/>
+      </w:pPr>
+      <w:r>
+        <w:rPr>
+          <w:rFonts w:ascii="Calibri" w:cs="Calibri" w:eastAsia="Calibri" w:hAnsi="Calibri"/>
+          <w:b w:val="false"/>
+          <w:bCs w:val="false"/>
+          <w:color w:val="1E293B"/>
+          <w:sz w:val="20"/>
+          <w:szCs w:val="20"/>
+        </w:rPr>
+        <w:t xml:space="preserve">1.4 Mô Hình Phát Triển Trợ Lý Ảo Chatbot (Kiến Trúc RAG - Retrieval-Augmented Generation)</w:t>
       </w:r>
     </w:p>
     <w:p>
@@ -2895,6 +2912,2091 @@
     <w:p>
       <w:pPr>
         <w:spacing w:after="160" w:before="0"/>
+      </w:pPr>
+    </w:p>
+    <w:p>
+      <w:pPr>
+        <w:pStyle w:val="Heading2"/>
+        <w:spacing w:after="100" w:before="260"/>
+      </w:pPr>
+      <w:r>
+        <w:rPr>
+          <w:rFonts w:ascii="Calibri" w:cs="Calibri" w:eastAsia="Calibri" w:hAnsi="Calibri"/>
+          <w:b/>
+          <w:bCs/>
+          <w:color w:val="2563EB"/>
+          <w:sz w:val="26"/>
+          <w:szCs w:val="26"/>
+        </w:rPr>
+        <w:t xml:space="preserve">1.4 Mô Hình Phát Triển Trợ Lý Ảo Chatbot (Kiến Trúc RAG - Retrieval-Augmented Generation)</w:t>
+      </w:r>
+    </w:p>
+    <w:p>
+      <w:pPr>
+        <w:spacing w:after="120" w:before="60" w:line="276"/>
+        <w:jc w:val="both"/>
+      </w:pPr>
+      <w:r>
+        <w:rPr>
+          <w:rFonts w:ascii="Calibri" w:cs="Calibri" w:eastAsia="Calibri" w:hAnsi="Calibri"/>
+          <w:color w:val="1E293B"/>
+          <w:sz w:val="22"/>
+          <w:szCs w:val="22"/>
+        </w:rPr>
+        <w:t xml:space="preserve">Nhằm đáp ứng yêu cầu nghiệp vụ khắt khe của ngành lưu trú và giải quyết triệt để điểm yếu cố hữu của các mô hình ngôn ngữ lớn (LLMs), hệ thống AURA STAY ứng dụng kiến trúc </w:t>
+      </w:r>
+      <w:r>
+        <w:rPr>
+          <w:rFonts w:ascii="Calibri" w:cs="Calibri" w:eastAsia="Calibri" w:hAnsi="Calibri"/>
+          <w:b/>
+          <w:bCs/>
+          <w:color w:val="0F172A"/>
+          <w:sz w:val="22"/>
+          <w:szCs w:val="22"/>
+        </w:rPr>
+        <w:t xml:space="preserve">RAG (Retrieval-Augmented Generation - Tạo sinh tăng cường truy xuất dữ liệu)</w:t>
+      </w:r>
+      <w:r>
+        <w:rPr>
+          <w:rFonts w:ascii="Calibri" w:cs="Calibri" w:eastAsia="Calibri" w:hAnsi="Calibri"/>
+          <w:color w:val="1E293B"/>
+          <w:sz w:val="22"/>
+          <w:szCs w:val="22"/>
+        </w:rPr>
+        <w:t xml:space="preserve"> vào module Trợ lý ảo Concierge AI.</w:t>
+      </w:r>
+    </w:p>
+    <w:p>
+      <w:pPr>
+        <w:pStyle w:val="Heading3"/>
+        <w:spacing w:after="80" w:before="200"/>
+      </w:pPr>
+      <w:r>
+        <w:rPr>
+          <w:rFonts w:ascii="Calibri" w:cs="Calibri" w:eastAsia="Calibri" w:hAnsi="Calibri"/>
+          <w:b/>
+          <w:bCs/>
+          <w:color w:val="0F172A"/>
+          <w:sz w:val="23"/>
+          <w:szCs w:val="23"/>
+        </w:rPr>
+        <w:t xml:space="preserve">1.4.1 Yêu Cầu Cốt Lõi (User Story &amp; System Constraints)</w:t>
+      </w:r>
+    </w:p>
+    <w:p>
+      <w:pPr>
+        <w:pStyle w:val="ListParagraph"/>
+        <w:numPr>
+          <w:ilvl w:val="0"/>
+          <w:numId w:val="1"/>
+        </w:numPr>
+        <w:spacing w:after="40" w:before="40" w:line="260"/>
+      </w:pPr>
+      <w:r>
+        <w:rPr>
+          <w:rFonts w:ascii="Calibri" w:cs="Calibri" w:eastAsia="Calibri" w:hAnsi="Calibri"/>
+          <w:color w:val="1E293B"/>
+          <w:sz w:val="22"/>
+          <w:szCs w:val="22"/>
+        </w:rPr>
+        <w:t xml:space="preserve">⚠️ </w:t>
+      </w:r>
+      <w:r>
+        <w:rPr>
+          <w:rFonts w:ascii="Calibri" w:cs="Calibri" w:eastAsia="Calibri" w:hAnsi="Calibri"/>
+          <w:b/>
+          <w:bCs/>
+          <w:color w:val="0F172A"/>
+          <w:sz w:val="22"/>
+          <w:szCs w:val="22"/>
+        </w:rPr>
+        <w:t xml:space="preserve">Không được bịa đặt (Zero Hallucination)</w:t>
+      </w:r>
+      <w:r>
+        <w:rPr>
+          <w:rFonts w:ascii="Calibri" w:cs="Calibri" w:eastAsia="Calibri" w:hAnsi="Calibri"/>
+          <w:color w:val="1E293B"/>
+          <w:sz w:val="22"/>
+          <w:szCs w:val="22"/>
+        </w:rPr>
+        <w:t xml:space="preserve">: Mô hình ngôn ngữ lớn (LLM) tuyệt đối không được tự suy diễn hoặc bịa ra thông tin sai lệch về giá phòng, chính sách hủy phòng hoặc các dịch vụ không có thực.</w:t>
+      </w:r>
+    </w:p>
+    <w:p>
+      <w:pPr>
+        <w:pStyle w:val="ListParagraph"/>
+        <w:numPr>
+          <w:ilvl w:val="0"/>
+          <w:numId w:val="1"/>
+        </w:numPr>
+        <w:spacing w:after="40" w:before="40" w:line="260"/>
+      </w:pPr>
+      <w:r>
+        <w:rPr>
+          <w:rFonts w:ascii="Calibri" w:cs="Calibri" w:eastAsia="Calibri" w:hAnsi="Calibri"/>
+          <w:b/>
+          <w:bCs/>
+          <w:color w:val="0F172A"/>
+          <w:sz w:val="22"/>
+          <w:szCs w:val="22"/>
+        </w:rPr>
+        <w:t xml:space="preserve">Chỉ sử dụng dữ liệu hiện có (Strict Context Grounding)</w:t>
+      </w:r>
+      <w:r>
+        <w:rPr>
+          <w:rFonts w:ascii="Calibri" w:cs="Calibri" w:eastAsia="Calibri" w:hAnsi="Calibri"/>
+          <w:color w:val="1E293B"/>
+          <w:sz w:val="22"/>
+          <w:szCs w:val="22"/>
+        </w:rPr>
+        <w:t xml:space="preserve">: Chatbot chỉ được phép trả lời dựa trên kho tri thức xác thực do khu nghỉ dưỡng cung cấp (tài liệu nội bộ, thông số phòng ốc, chính sách trẻ em và biểu giá niêm yết).</w:t>
+      </w:r>
+    </w:p>
+    <w:p>
+      <w:pPr>
+        <w:pStyle w:val="ListParagraph"/>
+        <w:numPr>
+          <w:ilvl w:val="0"/>
+          <w:numId w:val="1"/>
+        </w:numPr>
+        <w:spacing w:after="40" w:before="40" w:line="260"/>
+      </w:pPr>
+      <w:r>
+        <w:rPr>
+          <w:rFonts w:ascii="Calibri" w:cs="Calibri" w:eastAsia="Calibri" w:hAnsi="Calibri"/>
+          <w:b/>
+          <w:bCs/>
+          <w:color w:val="0F172A"/>
+          <w:sz w:val="22"/>
+          <w:szCs w:val="22"/>
+        </w:rPr>
+        <w:t xml:space="preserve">Vận hành trên hạ tầng Cloudflare Edge (CF)</w:t>
+      </w:r>
+      <w:r>
+        <w:rPr>
+          <w:rFonts w:ascii="Calibri" w:cs="Calibri" w:eastAsia="Calibri" w:hAnsi="Calibri"/>
+          <w:color w:val="1E293B"/>
+          <w:sz w:val="22"/>
+          <w:szCs w:val="22"/>
+        </w:rPr>
+        <w:t xml:space="preserve">: Tận dụng mạng lưới biên phân tán của Cloudflare (Cloudflare Workers, Cloudflare Vectorize và Workers AI) giúp phản hồi tức thì với độ trễ cực thấp (&lt; 50ms) và tối ưu hóa 100% chi phí vận hành.</w:t>
+      </w:r>
+    </w:p>
+    <w:p>
+      <w:pPr>
+        <w:pStyle w:val="Heading3"/>
+        <w:spacing w:after="80" w:before="200"/>
+      </w:pPr>
+      <w:r>
+        <w:rPr>
+          <w:rFonts w:ascii="Calibri" w:cs="Calibri" w:eastAsia="Calibri" w:hAnsi="Calibri"/>
+          <w:b/>
+          <w:bCs/>
+          <w:color w:val="0F172A"/>
+          <w:sz w:val="23"/>
+          <w:szCs w:val="23"/>
+        </w:rPr>
+        <w:t xml:space="preserve">1.4.2 Sơ Đồ Quy Trình Vận Hành Kiến Trúc RAG</w:t>
+      </w:r>
+    </w:p>
+    <w:p>
+      <w:pPr>
+        <w:spacing w:after="120" w:before="60" w:line="276"/>
+        <w:jc w:val="both"/>
+      </w:pPr>
+      <w:r>
+        <w:rPr>
+          <w:rFonts w:ascii="Calibri" w:cs="Calibri" w:eastAsia="Calibri" w:hAnsi="Calibri"/>
+          <w:color w:val="1E293B"/>
+          <w:sz w:val="22"/>
+          <w:szCs w:val="22"/>
+        </w:rPr>
+        <w:t xml:space="preserve">Hệ thống hoạt động đồng bộ qua hai luồng xử lý độc lập: </w:t>
+      </w:r>
+      <w:r>
+        <w:rPr>
+          <w:rFonts w:ascii="Calibri" w:cs="Calibri" w:eastAsia="Calibri" w:hAnsi="Calibri"/>
+          <w:b/>
+          <w:bCs/>
+          <w:color w:val="0F172A"/>
+          <w:sz w:val="22"/>
+          <w:szCs w:val="22"/>
+        </w:rPr>
+        <w:t xml:space="preserve">Luồng nạp dữ liệu tri thức (Offline Ingestion Pipeline)</w:t>
+      </w:r>
+      <w:r>
+        <w:rPr>
+          <w:rFonts w:ascii="Calibri" w:cs="Calibri" w:eastAsia="Calibri" w:hAnsi="Calibri"/>
+          <w:color w:val="1E293B"/>
+          <w:sz w:val="22"/>
+          <w:szCs w:val="22"/>
+        </w:rPr>
+        <w:t xml:space="preserve"> và </w:t>
+      </w:r>
+      <w:r>
+        <w:rPr>
+          <w:rFonts w:ascii="Calibri" w:cs="Calibri" w:eastAsia="Calibri" w:hAnsi="Calibri"/>
+          <w:b/>
+          <w:bCs/>
+          <w:color w:val="0F172A"/>
+          <w:sz w:val="22"/>
+          <w:szCs w:val="22"/>
+        </w:rPr>
+        <w:t xml:space="preserve">Luồng truy xuất &amp; sinh phản hồi theo thời gian thực (Online Retrieval Pipeline)</w:t>
+      </w:r>
+      <w:r>
+        <w:rPr>
+          <w:rFonts w:ascii="Calibri" w:cs="Calibri" w:eastAsia="Calibri" w:hAnsi="Calibri"/>
+          <w:color w:val="1E293B"/>
+          <w:sz w:val="22"/>
+          <w:szCs w:val="22"/>
+        </w:rPr>
+        <w:t xml:space="preserve">:</w:t>
+      </w:r>
+    </w:p>
+    <w:p>
+      <w:pPr>
+        <w:pBdr>
+          <w:left w:val="single" w:color="3B82F6" w:sz="18" w:space="10"/>
+        </w:pBdr>
+        <w:shd w:fill="F1F5F9" w:val="clear"/>
+        <w:spacing w:after="0" w:before="80" w:line="220"/>
+        <w:ind w:left="240"/>
+      </w:pPr>
+      <w:r>
+        <w:rPr>
+          <w:rFonts w:ascii="Consolas" w:cs="Consolas" w:eastAsia="Consolas" w:hAnsi="Consolas"/>
+          <w:color w:val="0F172A"/>
+          <w:sz w:val="16"/>
+          <w:szCs w:val="16"/>
+        </w:rPr>
+        <w:t xml:space="preserve">[ NGUỒN TRI THỨC NỘI BỘ ]</w:t>
+      </w:r>
+    </w:p>
+    <w:p>
+      <w:pPr>
+        <w:pBdr>
+          <w:left w:val="single" w:color="3B82F6" w:sz="18" w:space="10"/>
+        </w:pBdr>
+        <w:shd w:fill="F1F5F9" w:val="clear"/>
+        <w:spacing w:after="0" w:before="0" w:line="220"/>
+        <w:ind w:left="240"/>
+      </w:pPr>
+      <w:r>
+        <w:rPr>
+          <w:rFonts w:ascii="Consolas" w:cs="Consolas" w:eastAsia="Consolas" w:hAnsi="Consolas"/>
+          <w:color w:val="0F172A"/>
+          <w:sz w:val="16"/>
+          <w:szCs w:val="16"/>
+        </w:rPr>
+        <w:t xml:space="preserve">(Knowledge: .pdf, .docx, private docs)</w:t>
+      </w:r>
+    </w:p>
+    <w:p>
+      <w:pPr>
+        <w:pBdr>
+          <w:left w:val="single" w:color="3B82F6" w:sz="18" w:space="10"/>
+        </w:pBdr>
+        <w:shd w:fill="F1F5F9" w:val="clear"/>
+        <w:spacing w:after="0" w:before="0" w:line="220"/>
+        <w:ind w:left="240"/>
+      </w:pPr>
+      <w:r>
+        <w:rPr>
+          <w:rFonts w:ascii="Consolas" w:cs="Consolas" w:eastAsia="Consolas" w:hAnsi="Consolas"/>
+          <w:color w:val="0F172A"/>
+          <w:sz w:val="16"/>
+          <w:szCs w:val="16"/>
+        </w:rPr>
+        <w:t xml:space="preserve">          │</w:t>
+      </w:r>
+    </w:p>
+    <w:p>
+      <w:pPr>
+        <w:pBdr>
+          <w:left w:val="single" w:color="3B82F6" w:sz="18" w:space="10"/>
+        </w:pBdr>
+        <w:shd w:fill="F1F5F9" w:val="clear"/>
+        <w:spacing w:after="0" w:before="0" w:line="220"/>
+        <w:ind w:left="240"/>
+      </w:pPr>
+      <w:r>
+        <w:rPr>
+          <w:rFonts w:ascii="Consolas" w:cs="Consolas" w:eastAsia="Consolas" w:hAnsi="Consolas"/>
+          <w:color w:val="0F172A"/>
+          <w:sz w:val="16"/>
+          <w:szCs w:val="16"/>
+        </w:rPr>
+        <w:t xml:space="preserve">          ▼</w:t>
+      </w:r>
+    </w:p>
+    <w:p>
+      <w:pPr>
+        <w:pBdr>
+          <w:left w:val="single" w:color="3B82F6" w:sz="18" w:space="10"/>
+        </w:pBdr>
+        <w:shd w:fill="F1F5F9" w:val="clear"/>
+        <w:spacing w:after="0" w:before="0" w:line="220"/>
+        <w:ind w:left="240"/>
+      </w:pPr>
+      <w:r>
+        <w:rPr>
+          <w:rFonts w:ascii="Consolas" w:cs="Consolas" w:eastAsia="Consolas" w:hAnsi="Consolas"/>
+          <w:color w:val="0F172A"/>
+          <w:sz w:val="16"/>
+          <w:szCs w:val="16"/>
+        </w:rPr>
+        <w:t xml:space="preserve">    [ CHUNKING ] ──► Chia văn bản thành các khối nhỏ (300 - 500 tokens, 50 tokens overlap)</w:t>
+      </w:r>
+    </w:p>
+    <w:p>
+      <w:pPr>
+        <w:pBdr>
+          <w:left w:val="single" w:color="3B82F6" w:sz="18" w:space="10"/>
+        </w:pBdr>
+        <w:shd w:fill="F1F5F9" w:val="clear"/>
+        <w:spacing w:after="0" w:before="0" w:line="220"/>
+        <w:ind w:left="240"/>
+      </w:pPr>
+      <w:r>
+        <w:rPr>
+          <w:rFonts w:ascii="Consolas" w:cs="Consolas" w:eastAsia="Consolas" w:hAnsi="Consolas"/>
+          <w:color w:val="0F172A"/>
+          <w:sz w:val="16"/>
+          <w:szCs w:val="16"/>
+        </w:rPr>
+        <w:t xml:space="preserve">          │</w:t>
+      </w:r>
+    </w:p>
+    <w:p>
+      <w:pPr>
+        <w:pBdr>
+          <w:left w:val="single" w:color="3B82F6" w:sz="18" w:space="10"/>
+        </w:pBdr>
+        <w:shd w:fill="F1F5F9" w:val="clear"/>
+        <w:spacing w:after="0" w:before="0" w:line="220"/>
+        <w:ind w:left="240"/>
+      </w:pPr>
+      <w:r>
+        <w:rPr>
+          <w:rFonts w:ascii="Consolas" w:cs="Consolas" w:eastAsia="Consolas" w:hAnsi="Consolas"/>
+          <w:color w:val="0F172A"/>
+          <w:sz w:val="16"/>
+          <w:szCs w:val="16"/>
+        </w:rPr>
+        <w:t xml:space="preserve">          ▼</w:t>
+      </w:r>
+    </w:p>
+    <w:p>
+      <w:pPr>
+        <w:pBdr>
+          <w:left w:val="single" w:color="3B82F6" w:sz="18" w:space="10"/>
+        </w:pBdr>
+        <w:shd w:fill="F1F5F9" w:val="clear"/>
+        <w:spacing w:after="0" w:before="0" w:line="220"/>
+        <w:ind w:left="240"/>
+      </w:pPr>
+      <w:r>
+        <w:rPr>
+          <w:rFonts w:ascii="Consolas" w:cs="Consolas" w:eastAsia="Consolas" w:hAnsi="Consolas"/>
+          <w:color w:val="0F172A"/>
+          <w:sz w:val="16"/>
+          <w:szCs w:val="16"/>
+        </w:rPr>
+        <w:t xml:space="preserve"> ① [ WORD EMBEDDING ] ──► Chuyển đổi ngữ nghĩa văn bản thành Vector [1024 chiều]</w:t>
+      </w:r>
+    </w:p>
+    <w:p>
+      <w:pPr>
+        <w:pBdr>
+          <w:left w:val="single" w:color="3B82F6" w:sz="18" w:space="10"/>
+        </w:pBdr>
+        <w:shd w:fill="F1F5F9" w:val="clear"/>
+        <w:spacing w:after="0" w:before="0" w:line="220"/>
+        <w:ind w:left="240"/>
+      </w:pPr>
+      <w:r>
+        <w:rPr>
+          <w:rFonts w:ascii="Consolas" w:cs="Consolas" w:eastAsia="Consolas" w:hAnsi="Consolas"/>
+          <w:color w:val="0F172A"/>
+          <w:sz w:val="16"/>
+          <w:szCs w:val="16"/>
+        </w:rPr>
+        <w:t xml:space="preserve">          │</w:t>
+      </w:r>
+    </w:p>
+    <w:p>
+      <w:pPr>
+        <w:pBdr>
+          <w:left w:val="single" w:color="3B82F6" w:sz="18" w:space="10"/>
+        </w:pBdr>
+        <w:shd w:fill="F1F5F9" w:val="clear"/>
+        <w:spacing w:after="0" w:before="0" w:line="220"/>
+        <w:ind w:left="240"/>
+      </w:pPr>
+      <w:r>
+        <w:rPr>
+          <w:rFonts w:ascii="Consolas" w:cs="Consolas" w:eastAsia="Consolas" w:hAnsi="Consolas"/>
+          <w:color w:val="0F172A"/>
+          <w:sz w:val="16"/>
+          <w:szCs w:val="16"/>
+        </w:rPr>
+        <w:t xml:space="preserve">          ▼ (Index)</w:t>
+      </w:r>
+    </w:p>
+    <w:p>
+      <w:pPr>
+        <w:pBdr>
+          <w:left w:val="single" w:color="3B82F6" w:sz="18" w:space="10"/>
+        </w:pBdr>
+        <w:shd w:fill="F1F5F9" w:val="clear"/>
+        <w:spacing w:after="0" w:before="0" w:line="220"/>
+        <w:ind w:left="240"/>
+      </w:pPr>
+      <w:r>
+        <w:rPr>
+          <w:rFonts w:ascii="Consolas" w:cs="Consolas" w:eastAsia="Consolas" w:hAnsi="Consolas"/>
+          <w:color w:val="0F172A"/>
+          <w:sz w:val="16"/>
+          <w:szCs w:val="16"/>
+        </w:rPr>
+        <w:t xml:space="preserve"> ┌────────────────────────────────────────────────────────────────────────┐</w:t>
+      </w:r>
+    </w:p>
+    <w:p>
+      <w:pPr>
+        <w:pBdr>
+          <w:left w:val="single" w:color="3B82F6" w:sz="18" w:space="10"/>
+        </w:pBdr>
+        <w:shd w:fill="F1F5F9" w:val="clear"/>
+        <w:spacing w:after="0" w:before="0" w:line="220"/>
+        <w:ind w:left="240"/>
+      </w:pPr>
+      <w:r>
+        <w:rPr>
+          <w:rFonts w:ascii="Consolas" w:cs="Consolas" w:eastAsia="Consolas" w:hAnsi="Consolas"/>
+          <w:color w:val="0F172A"/>
+          <w:sz w:val="16"/>
+          <w:szCs w:val="16"/>
+        </w:rPr>
+        <w:t xml:space="preserve"> │                    ② DB VECTOR (Cloudflare Vectorize)                 │</w:t>
+      </w:r>
+    </w:p>
+    <w:p>
+      <w:pPr>
+        <w:pBdr>
+          <w:left w:val="single" w:color="3B82F6" w:sz="18" w:space="10"/>
+        </w:pBdr>
+        <w:shd w:fill="F1F5F9" w:val="clear"/>
+        <w:spacing w:after="0" w:before="0" w:line="220"/>
+        <w:ind w:left="240"/>
+      </w:pPr>
+      <w:r>
+        <w:rPr>
+          <w:rFonts w:ascii="Consolas" w:cs="Consolas" w:eastAsia="Consolas" w:hAnsi="Consolas"/>
+          <w:color w:val="0F172A"/>
+          <w:sz w:val="16"/>
+          <w:szCs w:val="16"/>
+        </w:rPr>
+        <w:t xml:space="preserve"> │            - Lưu trữ các vector tri thức của resort                    │</w:t>
+      </w:r>
+    </w:p>
+    <w:p>
+      <w:pPr>
+        <w:pBdr>
+          <w:left w:val="single" w:color="3B82F6" w:sz="18" w:space="10"/>
+        </w:pBdr>
+        <w:shd w:fill="F1F5F9" w:val="clear"/>
+        <w:spacing w:after="0" w:before="0" w:line="220"/>
+        <w:ind w:left="240"/>
+      </w:pPr>
+      <w:r>
+        <w:rPr>
+          <w:rFonts w:ascii="Consolas" w:cs="Consolas" w:eastAsia="Consolas" w:hAnsi="Consolas"/>
+          <w:color w:val="0F172A"/>
+          <w:sz w:val="16"/>
+          <w:szCs w:val="16"/>
+        </w:rPr>
+        <w:t xml:space="preserve"> │            - Thuật toán đo khoảng cách ngữ nghĩa: Cosine Similarity    │</w:t>
+      </w:r>
+    </w:p>
+    <w:p>
+      <w:pPr>
+        <w:pBdr>
+          <w:left w:val="single" w:color="3B82F6" w:sz="18" w:space="10"/>
+        </w:pBdr>
+        <w:shd w:fill="F1F5F9" w:val="clear"/>
+        <w:spacing w:after="0" w:before="0" w:line="220"/>
+        <w:ind w:left="240"/>
+      </w:pPr>
+      <w:r>
+        <w:rPr>
+          <w:rFonts w:ascii="Consolas" w:cs="Consolas" w:eastAsia="Consolas" w:hAnsi="Consolas"/>
+          <w:color w:val="0F172A"/>
+          <w:sz w:val="16"/>
+          <w:szCs w:val="16"/>
+        </w:rPr>
+        <w:t xml:space="preserve"> └──────────────────────────────────┬─────────────────────────────────────┘</w:t>
+      </w:r>
+    </w:p>
+    <w:p>
+      <w:pPr>
+        <w:pBdr>
+          <w:left w:val="single" w:color="3B82F6" w:sz="18" w:space="10"/>
+        </w:pBdr>
+        <w:shd w:fill="F1F5F9" w:val="clear"/>
+        <w:spacing w:after="0" w:before="0" w:line="220"/>
+        <w:ind w:left="240"/>
+      </w:pPr>
+      <w:r>
+        <w:rPr>
+          <w:rFonts w:ascii="Consolas" w:cs="Consolas" w:eastAsia="Consolas" w:hAnsi="Consolas"/>
+          <w:color w:val="0F172A"/>
+          <w:sz w:val="16"/>
+          <w:szCs w:val="16"/>
+        </w:rPr>
+        <w:t xml:space="preserve">                                    ▲</w:t>
+      </w:r>
+    </w:p>
+    <w:p>
+      <w:pPr>
+        <w:pBdr>
+          <w:left w:val="single" w:color="3B82F6" w:sz="18" w:space="10"/>
+        </w:pBdr>
+        <w:shd w:fill="F1F5F9" w:val="clear"/>
+        <w:spacing w:after="0" w:before="0" w:line="220"/>
+        <w:ind w:left="240"/>
+      </w:pPr>
+      <w:r>
+        <w:rPr>
+          <w:rFonts w:ascii="Consolas" w:cs="Consolas" w:eastAsia="Consolas" w:hAnsi="Consolas"/>
+          <w:color w:val="0F172A"/>
+          <w:sz w:val="16"/>
+          <w:szCs w:val="16"/>
+        </w:rPr>
+        <w:t xml:space="preserve">                                    │ (Cosine Similarity Search)</w:t>
+      </w:r>
+    </w:p>
+    <w:p>
+      <w:pPr>
+        <w:pBdr>
+          <w:left w:val="single" w:color="3B82F6" w:sz="18" w:space="10"/>
+        </w:pBdr>
+        <w:shd w:fill="F1F5F9" w:val="clear"/>
+        <w:spacing w:after="0" w:before="0" w:line="220"/>
+        <w:ind w:left="240"/>
+      </w:pPr>
+      <w:r>
+        <w:rPr>
+          <w:rFonts w:ascii="Consolas" w:cs="Consolas" w:eastAsia="Consolas" w:hAnsi="Consolas"/>
+          <w:color w:val="0F172A"/>
+          <w:sz w:val="16"/>
+          <w:szCs w:val="16"/>
+        </w:rPr>
+        <w:t xml:space="preserve">                                    │</w:t>
+      </w:r>
+    </w:p>
+    <w:p>
+      <w:pPr>
+        <w:pBdr>
+          <w:left w:val="single" w:color="3B82F6" w:sz="18" w:space="10"/>
+        </w:pBdr>
+        <w:shd w:fill="F1F5F9" w:val="clear"/>
+        <w:spacing w:after="0" w:before="0" w:line="220"/>
+        <w:ind w:left="240"/>
+      </w:pPr>
+      <w:r>
+        <w:rPr>
+          <w:rFonts w:ascii="Consolas" w:cs="Consolas" w:eastAsia="Consolas" w:hAnsi="Consolas"/>
+          <w:color w:val="0F172A"/>
+          <w:sz w:val="16"/>
+          <w:szCs w:val="16"/>
+        </w:rPr>
+        <w:t xml:space="preserve">                                    ├──────────────────────────┐</w:t>
+      </w:r>
+    </w:p>
+    <w:p>
+      <w:pPr>
+        <w:pBdr>
+          <w:left w:val="single" w:color="3B82F6" w:sz="18" w:space="10"/>
+        </w:pBdr>
+        <w:shd w:fill="F1F5F9" w:val="clear"/>
+        <w:spacing w:after="0" w:before="0" w:line="220"/>
+        <w:ind w:left="240"/>
+      </w:pPr>
+      <w:r>
+        <w:rPr>
+          <w:rFonts w:ascii="Consolas" w:cs="Consolas" w:eastAsia="Consolas" w:hAnsi="Consolas"/>
+          <w:color w:val="0F172A"/>
+          <w:sz w:val="16"/>
+          <w:szCs w:val="16"/>
+        </w:rPr>
+        <w:t xml:space="preserve">                                    │ (Truy xuất Top-K)        │</w:t>
+      </w:r>
+    </w:p>
+    <w:p>
+      <w:pPr>
+        <w:pBdr>
+          <w:left w:val="single" w:color="3B82F6" w:sz="18" w:space="10"/>
+        </w:pBdr>
+        <w:shd w:fill="F1F5F9" w:val="clear"/>
+        <w:spacing w:after="0" w:before="0" w:line="220"/>
+        <w:ind w:left="240"/>
+      </w:pPr>
+      <w:r>
+        <w:rPr>
+          <w:rFonts w:ascii="Consolas" w:cs="Consolas" w:eastAsia="Consolas" w:hAnsi="Consolas"/>
+          <w:color w:val="0F172A"/>
+          <w:sz w:val="16"/>
+          <w:szCs w:val="16"/>
+        </w:rPr>
+        <w:t xml:space="preserve">                                    │                          │</w:t>
+      </w:r>
+    </w:p>
+    <w:p>
+      <w:pPr>
+        <w:pBdr>
+          <w:left w:val="single" w:color="3B82F6" w:sz="18" w:space="10"/>
+        </w:pBdr>
+        <w:shd w:fill="F1F5F9" w:val="clear"/>
+        <w:spacing w:after="0" w:before="0" w:line="220"/>
+        <w:ind w:left="240"/>
+      </w:pPr>
+      <w:r>
+        <w:rPr>
+          <w:rFonts w:ascii="Consolas" w:cs="Consolas" w:eastAsia="Consolas" w:hAnsi="Consolas"/>
+          <w:color w:val="0F172A"/>
+          <w:sz w:val="16"/>
+          <w:szCs w:val="16"/>
+        </w:rPr>
+        <w:t xml:space="preserve">          [ NGƯỜI DÙNG / KHÁCH ]     │                          ▼</w:t>
+      </w:r>
+    </w:p>
+    <w:p>
+      <w:pPr>
+        <w:pBdr>
+          <w:left w:val="single" w:color="3B82F6" w:sz="18" w:space="10"/>
+        </w:pBdr>
+        <w:shd w:fill="F1F5F9" w:val="clear"/>
+        <w:spacing w:after="0" w:before="0" w:line="220"/>
+        <w:ind w:left="240"/>
+      </w:pPr>
+      <w:r>
+        <w:rPr>
+          <w:rFonts w:ascii="Consolas" w:cs="Consolas" w:eastAsia="Consolas" w:hAnsi="Consolas"/>
+          <w:color w:val="0F172A"/>
+          <w:sz w:val="16"/>
+          <w:szCs w:val="16"/>
+        </w:rPr>
+        <w:t xml:space="preserve">                    │               │                 ┌─────────────────┐</w:t>
+      </w:r>
+    </w:p>
+    <w:p>
+      <w:pPr>
+        <w:pBdr>
+          <w:left w:val="single" w:color="3B82F6" w:sz="18" w:space="10"/>
+        </w:pBdr>
+        <w:shd w:fill="F1F5F9" w:val="clear"/>
+        <w:spacing w:after="0" w:before="0" w:line="220"/>
+        <w:ind w:left="240"/>
+      </w:pPr>
+      <w:r>
+        <w:rPr>
+          <w:rFonts w:ascii="Consolas" w:cs="Consolas" w:eastAsia="Consolas" w:hAnsi="Consolas"/>
+          <w:color w:val="0F172A"/>
+          <w:sz w:val="16"/>
+          <w:szCs w:val="16"/>
+        </w:rPr>
+        <w:t xml:space="preserve">                    ▼               │                 │   K PHẦN TỬ     │</w:t>
+      </w:r>
+    </w:p>
+    <w:p>
+      <w:pPr>
+        <w:pBdr>
+          <w:left w:val="single" w:color="3B82F6" w:sz="18" w:space="10"/>
+        </w:pBdr>
+        <w:shd w:fill="F1F5F9" w:val="clear"/>
+        <w:spacing w:after="0" w:before="0" w:line="220"/>
+        <w:ind w:left="240"/>
+      </w:pPr>
+      <w:r>
+        <w:rPr>
+          <w:rFonts w:ascii="Consolas" w:cs="Consolas" w:eastAsia="Consolas" w:hAnsi="Consolas"/>
+          <w:color w:val="0F172A"/>
+          <w:sz w:val="16"/>
+          <w:szCs w:val="16"/>
+        </w:rPr>
+        <w:t xml:space="preserve">             [ CÂU HỎI USER ] ──────┘                 │ (Top-K Chunks   │</w:t>
+      </w:r>
+    </w:p>
+    <w:p>
+      <w:pPr>
+        <w:pBdr>
+          <w:left w:val="single" w:color="3B82F6" w:sz="18" w:space="10"/>
+        </w:pBdr>
+        <w:shd w:fill="F1F5F9" w:val="clear"/>
+        <w:spacing w:after="0" w:before="0" w:line="220"/>
+        <w:ind w:left="240"/>
+      </w:pPr>
+      <w:r>
+        <w:rPr>
+          <w:rFonts w:ascii="Consolas" w:cs="Consolas" w:eastAsia="Consolas" w:hAnsi="Consolas"/>
+          <w:color w:val="0F172A"/>
+          <w:sz w:val="16"/>
+          <w:szCs w:val="16"/>
+        </w:rPr>
+        <w:t xml:space="preserve">                    │         (Vector hóa câu hỏi)    │  Ngữ cảnh thật) │</w:t>
+      </w:r>
+    </w:p>
+    <w:p>
+      <w:pPr>
+        <w:pBdr>
+          <w:left w:val="single" w:color="3B82F6" w:sz="18" w:space="10"/>
+        </w:pBdr>
+        <w:shd w:fill="F1F5F9" w:val="clear"/>
+        <w:spacing w:after="0" w:before="0" w:line="220"/>
+        <w:ind w:left="240"/>
+      </w:pPr>
+      <w:r>
+        <w:rPr>
+          <w:rFonts w:ascii="Consolas" w:cs="Consolas" w:eastAsia="Consolas" w:hAnsi="Consolas"/>
+          <w:color w:val="0F172A"/>
+          <w:sz w:val="16"/>
+          <w:szCs w:val="16"/>
+        </w:rPr>
+        <w:t xml:space="preserve">                    ▼                                 └────────┬────────┘</w:t>
+      </w:r>
+    </w:p>
+    <w:p>
+      <w:pPr>
+        <w:pBdr>
+          <w:left w:val="single" w:color="3B82F6" w:sz="18" w:space="10"/>
+        </w:pBdr>
+        <w:shd w:fill="F1F5F9" w:val="clear"/>
+        <w:spacing w:after="0" w:before="0" w:line="220"/>
+        <w:ind w:left="240"/>
+      </w:pPr>
+      <w:r>
+        <w:rPr>
+          <w:rFonts w:ascii="Consolas" w:cs="Consolas" w:eastAsia="Consolas" w:hAnsi="Consolas"/>
+          <w:color w:val="0F172A"/>
+          <w:sz w:val="16"/>
+          <w:szCs w:val="16"/>
+        </w:rPr>
+        <w:t xml:space="preserve">                    │                                          │</w:t>
+      </w:r>
+    </w:p>
+    <w:p>
+      <w:pPr>
+        <w:pBdr>
+          <w:left w:val="single" w:color="3B82F6" w:sz="18" w:space="10"/>
+        </w:pBdr>
+        <w:shd w:fill="F1F5F9" w:val="clear"/>
+        <w:spacing w:after="0" w:before="0" w:line="220"/>
+        <w:ind w:left="240"/>
+      </w:pPr>
+      <w:r>
+        <w:rPr>
+          <w:rFonts w:ascii="Consolas" w:cs="Consolas" w:eastAsia="Consolas" w:hAnsi="Consolas"/>
+          <w:color w:val="0F172A"/>
+          <w:sz w:val="16"/>
+          <w:szCs w:val="16"/>
+        </w:rPr>
+        <w:t xml:space="preserve">                    └───────────────────┬──────────────────────┘</w:t>
+      </w:r>
+    </w:p>
+    <w:p>
+      <w:pPr>
+        <w:pBdr>
+          <w:left w:val="single" w:color="3B82F6" w:sz="18" w:space="10"/>
+        </w:pBdr>
+        <w:shd w:fill="F1F5F9" w:val="clear"/>
+        <w:spacing w:after="0" w:before="0" w:line="220"/>
+        <w:ind w:left="240"/>
+      </w:pPr>
+      <w:r>
+        <w:rPr>
+          <w:rFonts w:ascii="Consolas" w:cs="Consolas" w:eastAsia="Consolas" w:hAnsi="Consolas"/>
+          <w:color w:val="0F172A"/>
+          <w:sz w:val="16"/>
+          <w:szCs w:val="16"/>
+        </w:rPr>
+        <w:t xml:space="preserve">                                        ▼</w:t>
+      </w:r>
+    </w:p>
+    <w:p>
+      <w:pPr>
+        <w:pBdr>
+          <w:left w:val="single" w:color="3B82F6" w:sz="18" w:space="10"/>
+        </w:pBdr>
+        <w:shd w:fill="F1F5F9" w:val="clear"/>
+        <w:spacing w:after="0" w:before="0" w:line="220"/>
+        <w:ind w:left="240"/>
+      </w:pPr>
+      <w:r>
+        <w:rPr>
+          <w:rFonts w:ascii="Consolas" w:cs="Consolas" w:eastAsia="Consolas" w:hAnsi="Consolas"/>
+          <w:color w:val="0F172A"/>
+          <w:sz w:val="16"/>
+          <w:szCs w:val="16"/>
+        </w:rPr>
+        <w:t xml:space="preserve">                               ┌─────────────────┐</w:t>
+      </w:r>
+    </w:p>
+    <w:p>
+      <w:pPr>
+        <w:pBdr>
+          <w:left w:val="single" w:color="3B82F6" w:sz="18" w:space="10"/>
+        </w:pBdr>
+        <w:shd w:fill="F1F5F9" w:val="clear"/>
+        <w:spacing w:after="0" w:before="0" w:line="220"/>
+        <w:ind w:left="240"/>
+      </w:pPr>
+      <w:r>
+        <w:rPr>
+          <w:rFonts w:ascii="Consolas" w:cs="Consolas" w:eastAsia="Consolas" w:hAnsi="Consolas"/>
+          <w:color w:val="0F172A"/>
+          <w:sz w:val="16"/>
+          <w:szCs w:val="16"/>
+        </w:rPr>
+        <w:t xml:space="preserve">                               │     ③ LLM       │ (Google Gemini 2.5 Flash / Llama 3)</w:t>
+      </w:r>
+    </w:p>
+    <w:p>
+      <w:pPr>
+        <w:pBdr>
+          <w:left w:val="single" w:color="3B82F6" w:sz="18" w:space="10"/>
+        </w:pBdr>
+        <w:shd w:fill="F1F5F9" w:val="clear"/>
+        <w:spacing w:after="0" w:before="0" w:line="220"/>
+        <w:ind w:left="240"/>
+      </w:pPr>
+      <w:r>
+        <w:rPr>
+          <w:rFonts w:ascii="Consolas" w:cs="Consolas" w:eastAsia="Consolas" w:hAnsi="Consolas"/>
+          <w:color w:val="0F172A"/>
+          <w:sz w:val="16"/>
+          <w:szCs w:val="16"/>
+        </w:rPr>
+        <w:t xml:space="preserve">                               │ (Augmented Text)│ Prompt = Ngữ cảnh thật + Câu hỏi</w:t>
+      </w:r>
+    </w:p>
+    <w:p>
+      <w:pPr>
+        <w:pBdr>
+          <w:left w:val="single" w:color="3B82F6" w:sz="18" w:space="10"/>
+        </w:pBdr>
+        <w:shd w:fill="F1F5F9" w:val="clear"/>
+        <w:spacing w:after="0" w:before="0" w:line="220"/>
+        <w:ind w:left="240"/>
+      </w:pPr>
+      <w:r>
+        <w:rPr>
+          <w:rFonts w:ascii="Consolas" w:cs="Consolas" w:eastAsia="Consolas" w:hAnsi="Consolas"/>
+          <w:color w:val="0F172A"/>
+          <w:sz w:val="16"/>
+          <w:szCs w:val="16"/>
+        </w:rPr>
+        <w:t xml:space="preserve">                               └────────┬────────┘</w:t>
+      </w:r>
+    </w:p>
+    <w:p>
+      <w:pPr>
+        <w:pBdr>
+          <w:left w:val="single" w:color="3B82F6" w:sz="18" w:space="10"/>
+        </w:pBdr>
+        <w:shd w:fill="F1F5F9" w:val="clear"/>
+        <w:spacing w:after="0" w:before="0" w:line="220"/>
+        <w:ind w:left="240"/>
+      </w:pPr>
+      <w:r>
+        <w:rPr>
+          <w:rFonts w:ascii="Consolas" w:cs="Consolas" w:eastAsia="Consolas" w:hAnsi="Consolas"/>
+          <w:color w:val="0F172A"/>
+          <w:sz w:val="16"/>
+          <w:szCs w:val="16"/>
+        </w:rPr>
+        <w:t xml:space="preserve">                                        ▼</w:t>
+      </w:r>
+    </w:p>
+    <w:p>
+      <w:pPr>
+        <w:pBdr>
+          <w:left w:val="single" w:color="3B82F6" w:sz="18" w:space="10"/>
+        </w:pBdr>
+        <w:shd w:fill="F1F5F9" w:val="clear"/>
+        <w:spacing w:after="0" w:before="0" w:line="220"/>
+        <w:ind w:left="240"/>
+      </w:pPr>
+      <w:r>
+        <w:rPr>
+          <w:rFonts w:ascii="Consolas" w:cs="Consolas" w:eastAsia="Consolas" w:hAnsi="Consolas"/>
+          <w:color w:val="0F172A"/>
+          <w:sz w:val="16"/>
+          <w:szCs w:val="16"/>
+        </w:rPr>
+        <w:t xml:space="preserve">                               [ CÂU TRẢ LỜI CHÍNH XÁC ]</w:t>
+      </w:r>
+    </w:p>
+    <w:p>
+      <w:pPr>
+        <w:pBdr>
+          <w:left w:val="single" w:color="3B82F6" w:sz="18" w:space="10"/>
+        </w:pBdr>
+        <w:shd w:fill="F1F5F9" w:val="clear"/>
+        <w:spacing w:after="80" w:before="0" w:line="220"/>
+        <w:ind w:left="240"/>
+      </w:pPr>
+      <w:r>
+        <w:rPr>
+          <w:rFonts w:ascii="Consolas" w:cs="Consolas" w:eastAsia="Consolas" w:hAnsi="Consolas"/>
+          <w:color w:val="0F172A"/>
+          <w:sz w:val="16"/>
+          <w:szCs w:val="16"/>
+        </w:rPr>
+        <w:t xml:space="preserve">                               (100% Theo dữ liệu thật, không bịa đặt)</w:t>
+      </w:r>
+    </w:p>
+    <w:p>
+      <w:pPr>
+        <w:spacing w:after="140" w:before="0"/>
+      </w:pPr>
+    </w:p>
+    <w:p>
+      <w:pPr>
+        <w:pStyle w:val="Heading3"/>
+        <w:spacing w:after="80" w:before="200"/>
+      </w:pPr>
+      <w:r>
+        <w:rPr>
+          <w:rFonts w:ascii="Calibri" w:cs="Calibri" w:eastAsia="Calibri" w:hAnsi="Calibri"/>
+          <w:b/>
+          <w:bCs/>
+          <w:color w:val="0F172A"/>
+          <w:sz w:val="23"/>
+          <w:szCs w:val="23"/>
+        </w:rPr>
+        <w:t xml:space="preserve">1.4.3 Chi Tiết Các Thành Phần Triển Khai</w:t>
+      </w:r>
+    </w:p>
+    <w:tbl>
+      <w:tblPr>
+        <w:tblW w:type="dxa" w:w="9026"/>
+        <w:tblBorders>
+          <w:top w:val="single" w:color="auto" w:sz="4"/>
+          <w:left w:val="single" w:color="auto" w:sz="4"/>
+          <w:bottom w:val="single" w:color="auto" w:sz="4"/>
+          <w:right w:val="single" w:color="auto" w:sz="4"/>
+          <w:insideH w:val="single" w:color="auto" w:sz="4"/>
+          <w:insideV w:val="single" w:color="auto" w:sz="4"/>
+        </w:tblBorders>
+      </w:tblPr>
+      <w:tblGrid>
+        <w:gridCol w:w="2400"/>
+        <w:gridCol w:w="3600"/>
+        <w:gridCol w:w="3026"/>
+      </w:tblGrid>
+      <w:tr>
+        <w:trPr>
+          <w:cantSplit/>
+          <w:tblHeader/>
+        </w:trPr>
+        <w:tc>
+          <w:tcPr>
+            <w:tcW w:type="dxa" w:w="2400"/>
+            <w:tcBorders>
+              <w:top w:val="single" w:color="1E3A8A" w:sz="6"/>
+              <w:left w:val="single" w:color="3B82F6" w:sz="4"/>
+              <w:bottom w:val="single" w:color="1E3A8A" w:sz="12"/>
+              <w:right w:val="single" w:color="3B82F6" w:sz="4"/>
+            </w:tcBorders>
+            <w:shd w:fill="1E3A8A" w:val="clear"/>
+            <w:tcMar>
+              <w:top w:type="dxa" w:w="140"/>
+              <w:left w:type="dxa" w:w="160"/>
+              <w:bottom w:type="dxa" w:w="140"/>
+              <w:right w:type="dxa" w:w="160"/>
+            </w:tcMar>
+          </w:tcPr>
+          <w:p>
+            <w:pPr>
+              <w:spacing w:after="60" w:before="60" w:line="240"/>
+              <w:jc w:val="center"/>
+            </w:pPr>
+            <w:r>
+              <w:rPr>
+                <w:rFonts w:ascii="Calibri" w:cs="Calibri" w:eastAsia="Calibri" w:hAnsi="Calibri"/>
+                <w:b/>
+                <w:bCs/>
+                <w:color w:val="FFFFFF"/>
+                <w:sz w:val="21"/>
+                <w:szCs w:val="21"/>
+              </w:rPr>
+              <w:t xml:space="preserve">Thành Phần Trong Mô Hình</w:t>
+            </w:r>
+          </w:p>
+        </w:tc>
+        <w:tc>
+          <w:tcPr>
+            <w:tcW w:type="dxa" w:w="3600"/>
+            <w:tcBorders>
+              <w:top w:val="single" w:color="1E3A8A" w:sz="6"/>
+              <w:left w:val="single" w:color="3B82F6" w:sz="4"/>
+              <w:bottom w:val="single" w:color="1E3A8A" w:sz="12"/>
+              <w:right w:val="single" w:color="3B82F6" w:sz="4"/>
+            </w:tcBorders>
+            <w:shd w:fill="1E3A8A" w:val="clear"/>
+            <w:tcMar>
+              <w:top w:type="dxa" w:w="140"/>
+              <w:left w:type="dxa" w:w="160"/>
+              <w:bottom w:type="dxa" w:w="140"/>
+              <w:right w:type="dxa" w:w="160"/>
+            </w:tcMar>
+          </w:tcPr>
+          <w:p>
+            <w:pPr>
+              <w:spacing w:after="60" w:before="60" w:line="240"/>
+              <w:jc w:val="center"/>
+            </w:pPr>
+            <w:r>
+              <w:rPr>
+                <w:rFonts w:ascii="Calibri" w:cs="Calibri" w:eastAsia="Calibri" w:hAnsi="Calibri"/>
+                <w:b/>
+                <w:bCs/>
+                <w:color w:val="FFFFFF"/>
+                <w:sz w:val="21"/>
+                <w:szCs w:val="21"/>
+              </w:rPr>
+              <w:t xml:space="preserve">Vai Trò &amp; Cơ Chế Hoạt Động</w:t>
+            </w:r>
+          </w:p>
+        </w:tc>
+        <w:tc>
+          <w:tcPr>
+            <w:tcW w:type="dxa" w:w="3026"/>
+            <w:tcBorders>
+              <w:top w:val="single" w:color="1E3A8A" w:sz="6"/>
+              <w:left w:val="single" w:color="3B82F6" w:sz="4"/>
+              <w:bottom w:val="single" w:color="1E3A8A" w:sz="12"/>
+              <w:right w:val="single" w:color="3B82F6" w:sz="4"/>
+            </w:tcBorders>
+            <w:shd w:fill="1E3A8A" w:val="clear"/>
+            <w:tcMar>
+              <w:top w:type="dxa" w:w="140"/>
+              <w:left w:type="dxa" w:w="160"/>
+              <w:bottom w:type="dxa" w:w="140"/>
+              <w:right w:type="dxa" w:w="160"/>
+            </w:tcMar>
+          </w:tcPr>
+          <w:p>
+            <w:pPr>
+              <w:spacing w:after="60" w:before="60" w:line="240"/>
+              <w:jc w:val="center"/>
+            </w:pPr>
+            <w:r>
+              <w:rPr>
+                <w:rFonts w:ascii="Calibri" w:cs="Calibri" w:eastAsia="Calibri" w:hAnsi="Calibri"/>
+                <w:b/>
+                <w:bCs/>
+                <w:color w:val="FFFFFF"/>
+                <w:sz w:val="21"/>
+                <w:szCs w:val="21"/>
+              </w:rPr>
+              <w:t xml:space="preserve">Công Nghệ Triển Khai Trong Dự Án</w:t>
+            </w:r>
+          </w:p>
+        </w:tc>
+      </w:tr>
+      <w:tr>
+        <w:trPr>
+          <w:cantSplit w:val="off"/>
+        </w:trPr>
+        <w:tc>
+          <w:tcPr>
+            <w:tcW w:type="dxa" w:w="2400"/>
+            <w:tcBorders>
+              <w:top w:val="single" w:color="CBD5E1" w:sz="4"/>
+              <w:left w:val="single" w:color="CBD5E1" w:sz="4"/>
+              <w:bottom w:val="single" w:color="CBD5E1" w:sz="4"/>
+              <w:right w:val="single" w:color="CBD5E1" w:sz="4"/>
+            </w:tcBorders>
+            <w:shd w:fill="FFFFFF" w:val="clear"/>
+            <w:tcMar>
+              <w:top w:type="dxa" w:w="120"/>
+              <w:left w:type="dxa" w:w="160"/>
+              <w:bottom w:type="dxa" w:w="120"/>
+              <w:right w:type="dxa" w:w="160"/>
+            </w:tcMar>
+          </w:tcPr>
+          <w:p>
+            <w:pPr>
+              <w:spacing w:after="60" w:before="60" w:line="240"/>
+              <w:jc w:val="left"/>
+            </w:pPr>
+            <w:r>
+              <w:rPr>
+                <w:rFonts w:ascii="Calibri" w:cs="Calibri" w:eastAsia="Calibri" w:hAnsi="Calibri"/>
+                <w:b/>
+                <w:bCs/>
+                <w:color w:val="1E293B"/>
+                <w:sz w:val="19"/>
+                <w:szCs w:val="19"/>
+              </w:rPr>
+              <w:t xml:space="preserve">Knowledge (Tài liệu nguồn)</w:t>
+            </w:r>
+          </w:p>
+        </w:tc>
+        <w:tc>
+          <w:tcPr>
+            <w:tcW w:type="dxa" w:w="3600"/>
+            <w:tcBorders>
+              <w:top w:val="single" w:color="CBD5E1" w:sz="4"/>
+              <w:left w:val="single" w:color="CBD5E1" w:sz="4"/>
+              <w:bottom w:val="single" w:color="CBD5E1" w:sz="4"/>
+              <w:right w:val="single" w:color="CBD5E1" w:sz="4"/>
+            </w:tcBorders>
+            <w:shd w:fill="FFFFFF" w:val="clear"/>
+            <w:tcMar>
+              <w:top w:type="dxa" w:w="120"/>
+              <w:left w:type="dxa" w:w="160"/>
+              <w:bottom w:type="dxa" w:w="120"/>
+              <w:right w:type="dxa" w:w="160"/>
+            </w:tcMar>
+          </w:tcPr>
+          <w:p>
+            <w:pPr>
+              <w:spacing w:after="60" w:before="60" w:line="240"/>
+              <w:jc w:val="left"/>
+            </w:pPr>
+            <w:r>
+              <w:rPr>
+                <w:rFonts w:ascii="Calibri" w:cs="Calibri" w:eastAsia="Calibri" w:hAnsi="Calibri"/>
+                <w:b w:val="false"/>
+                <w:bCs w:val="false"/>
+                <w:color w:val="1E293B"/>
+                <w:sz w:val="19"/>
+                <w:szCs w:val="19"/>
+              </w:rPr>
+              <w:t xml:space="preserve">Tập hợp các văn bản nghiệp vụ: Bảng giá phòng, quy chế nhận/trả phòng, menu ẩm thực, chính sách đón tiễn sân bay, quy định phụ thu trẻ em và thú cưng.</w:t>
+            </w:r>
+          </w:p>
+        </w:tc>
+        <w:tc>
+          <w:tcPr>
+            <w:tcW w:type="dxa" w:w="3026"/>
+            <w:tcBorders>
+              <w:top w:val="single" w:color="CBD5E1" w:sz="4"/>
+              <w:left w:val="single" w:color="CBD5E1" w:sz="4"/>
+              <w:bottom w:val="single" w:color="CBD5E1" w:sz="4"/>
+              <w:right w:val="single" w:color="CBD5E1" w:sz="4"/>
+            </w:tcBorders>
+            <w:shd w:fill="FFFFFF" w:val="clear"/>
+            <w:tcMar>
+              <w:top w:type="dxa" w:w="120"/>
+              <w:left w:type="dxa" w:w="160"/>
+              <w:bottom w:type="dxa" w:w="120"/>
+              <w:right w:type="dxa" w:w="160"/>
+            </w:tcMar>
+          </w:tcPr>
+          <w:p>
+            <w:pPr>
+              <w:spacing w:after="60" w:before="60" w:line="240"/>
+              <w:jc w:val="left"/>
+            </w:pPr>
+            <w:r>
+              <w:rPr>
+                <w:rFonts w:ascii="Consolas" w:cs="Consolas" w:eastAsia="Consolas" w:hAnsi="Consolas"/>
+                <w:b/>
+                <w:bCs/>
+                <w:color w:val="0369A1"/>
+                <w:sz w:val="18"/>
+                <w:szCs w:val="18"/>
+                <w:shd w:fill="F1F5F9" w:val="clear"/>
+              </w:rPr>
+              <w:t xml:space="preserve">.pdf</w:t>
+            </w:r>
+            <w:r>
+              <w:rPr>
+                <w:rFonts w:ascii="Calibri" w:cs="Calibri" w:eastAsia="Calibri" w:hAnsi="Calibri"/>
+                <w:b w:val="false"/>
+                <w:bCs w:val="false"/>
+                <w:color w:val="1E293B"/>
+                <w:sz w:val="19"/>
+                <w:szCs w:val="19"/>
+              </w:rPr>
+              <w:t xml:space="preserve">, </w:t>
+            </w:r>
+            <w:r>
+              <w:rPr>
+                <w:rFonts w:ascii="Consolas" w:cs="Consolas" w:eastAsia="Consolas" w:hAnsi="Consolas"/>
+                <w:b/>
+                <w:bCs/>
+                <w:color w:val="0369A1"/>
+                <w:sz w:val="18"/>
+                <w:szCs w:val="18"/>
+                <w:shd w:fill="F1F5F9" w:val="clear"/>
+              </w:rPr>
+              <w:t xml:space="preserve">.docx</w:t>
+            </w:r>
+            <w:r>
+              <w:rPr>
+                <w:rFonts w:ascii="Calibri" w:cs="Calibri" w:eastAsia="Calibri" w:hAnsi="Calibri"/>
+                <w:b w:val="false"/>
+                <w:bCs w:val="false"/>
+                <w:color w:val="1E293B"/>
+                <w:sz w:val="19"/>
+                <w:szCs w:val="19"/>
+              </w:rPr>
+              <w:t xml:space="preserve">, Markdown &amp; CSDL Quan hệ Cloudflare D1.</w:t>
+            </w:r>
+          </w:p>
+        </w:tc>
+      </w:tr>
+      <w:tr>
+        <w:trPr>
+          <w:cantSplit w:val="off"/>
+        </w:trPr>
+        <w:tc>
+          <w:tcPr>
+            <w:tcW w:type="dxa" w:w="2400"/>
+            <w:tcBorders>
+              <w:top w:val="single" w:color="CBD5E1" w:sz="4"/>
+              <w:left w:val="single" w:color="CBD5E1" w:sz="4"/>
+              <w:bottom w:val="single" w:color="CBD5E1" w:sz="4"/>
+              <w:right w:val="single" w:color="CBD5E1" w:sz="4"/>
+            </w:tcBorders>
+            <w:shd w:fill="F8FAFC" w:val="clear"/>
+            <w:tcMar>
+              <w:top w:type="dxa" w:w="120"/>
+              <w:left w:type="dxa" w:w="160"/>
+              <w:bottom w:type="dxa" w:w="120"/>
+              <w:right w:type="dxa" w:w="160"/>
+            </w:tcMar>
+          </w:tcPr>
+          <w:p>
+            <w:pPr>
+              <w:spacing w:after="60" w:before="60" w:line="240"/>
+              <w:jc w:val="left"/>
+            </w:pPr>
+            <w:r>
+              <w:rPr>
+                <w:rFonts w:ascii="Calibri" w:cs="Calibri" w:eastAsia="Calibri" w:hAnsi="Calibri"/>
+                <w:b/>
+                <w:bCs/>
+                <w:color w:val="1E293B"/>
+                <w:sz w:val="19"/>
+                <w:szCs w:val="19"/>
+              </w:rPr>
+              <w:t xml:space="preserve">Chunking (Phân đoạn)</w:t>
+            </w:r>
+          </w:p>
+        </w:tc>
+        <w:tc>
+          <w:tcPr>
+            <w:tcW w:type="dxa" w:w="3600"/>
+            <w:tcBorders>
+              <w:top w:val="single" w:color="CBD5E1" w:sz="4"/>
+              <w:left w:val="single" w:color="CBD5E1" w:sz="4"/>
+              <w:bottom w:val="single" w:color="CBD5E1" w:sz="4"/>
+              <w:right w:val="single" w:color="CBD5E1" w:sz="4"/>
+            </w:tcBorders>
+            <w:shd w:fill="F8FAFC" w:val="clear"/>
+            <w:tcMar>
+              <w:top w:type="dxa" w:w="120"/>
+              <w:left w:type="dxa" w:w="160"/>
+              <w:bottom w:type="dxa" w:w="120"/>
+              <w:right w:type="dxa" w:w="160"/>
+            </w:tcMar>
+          </w:tcPr>
+          <w:p>
+            <w:pPr>
+              <w:spacing w:after="60" w:before="60" w:line="240"/>
+              <w:jc w:val="left"/>
+            </w:pPr>
+            <w:r>
+              <w:rPr>
+                <w:rFonts w:ascii="Calibri" w:cs="Calibri" w:eastAsia="Calibri" w:hAnsi="Calibri"/>
+                <w:b w:val="false"/>
+                <w:bCs w:val="false"/>
+                <w:color w:val="1E293B"/>
+                <w:sz w:val="19"/>
+                <w:szCs w:val="19"/>
+              </w:rPr>
+              <w:t xml:space="preserve">Cắt nhỏ tài liệu thành các khối vừa vặn (300 - 500 từ) kèm khoảng gối đầu 50 từ (overlap) nhằm đảm bảo không bị đứt đoạn ngữ cảnh giữa các câu nối.</w:t>
+            </w:r>
+          </w:p>
+        </w:tc>
+        <w:tc>
+          <w:tcPr>
+            <w:tcW w:type="dxa" w:w="3026"/>
+            <w:tcBorders>
+              <w:top w:val="single" w:color="CBD5E1" w:sz="4"/>
+              <w:left w:val="single" w:color="CBD5E1" w:sz="4"/>
+              <w:bottom w:val="single" w:color="CBD5E1" w:sz="4"/>
+              <w:right w:val="single" w:color="CBD5E1" w:sz="4"/>
+            </w:tcBorders>
+            <w:shd w:fill="F8FAFC" w:val="clear"/>
+            <w:tcMar>
+              <w:top w:type="dxa" w:w="120"/>
+              <w:left w:type="dxa" w:w="160"/>
+              <w:bottom w:type="dxa" w:w="120"/>
+              <w:right w:type="dxa" w:w="160"/>
+            </w:tcMar>
+          </w:tcPr>
+          <w:p>
+            <w:pPr>
+              <w:spacing w:after="60" w:before="60" w:line="240"/>
+              <w:jc w:val="left"/>
+            </w:pPr>
+            <w:r>
+              <w:rPr>
+                <w:rFonts w:ascii="Calibri" w:cs="Calibri" w:eastAsia="Calibri" w:hAnsi="Calibri"/>
+                <w:b w:val="false"/>
+                <w:bCs w:val="false"/>
+                <w:color w:val="1E293B"/>
+                <w:sz w:val="19"/>
+                <w:szCs w:val="19"/>
+              </w:rPr>
+              <w:t xml:space="preserve">Thuật toán Recursive Character Text Splitter.</w:t>
+            </w:r>
+          </w:p>
+        </w:tc>
+      </w:tr>
+      <w:tr>
+        <w:trPr>
+          <w:cantSplit w:val="off"/>
+        </w:trPr>
+        <w:tc>
+          <w:tcPr>
+            <w:tcW w:type="dxa" w:w="2400"/>
+            <w:tcBorders>
+              <w:top w:val="single" w:color="CBD5E1" w:sz="4"/>
+              <w:left w:val="single" w:color="CBD5E1" w:sz="4"/>
+              <w:bottom w:val="single" w:color="CBD5E1" w:sz="4"/>
+              <w:right w:val="single" w:color="CBD5E1" w:sz="4"/>
+            </w:tcBorders>
+            <w:shd w:fill="FFFFFF" w:val="clear"/>
+            <w:tcMar>
+              <w:top w:type="dxa" w:w="120"/>
+              <w:left w:type="dxa" w:w="160"/>
+              <w:bottom w:type="dxa" w:w="120"/>
+              <w:right w:type="dxa" w:w="160"/>
+            </w:tcMar>
+          </w:tcPr>
+          <w:p>
+            <w:pPr>
+              <w:spacing w:after="60" w:before="60" w:line="240"/>
+              <w:jc w:val="left"/>
+            </w:pPr>
+            <w:r>
+              <w:rPr>
+                <w:rFonts w:ascii="Calibri" w:cs="Calibri" w:eastAsia="Calibri" w:hAnsi="Calibri"/>
+                <w:b/>
+                <w:bCs/>
+                <w:color w:val="1E293B"/>
+                <w:sz w:val="19"/>
+                <w:szCs w:val="19"/>
+              </w:rPr>
+              <w:t xml:space="preserve">① Word Embedding</w:t>
+            </w:r>
+          </w:p>
+        </w:tc>
+        <w:tc>
+          <w:tcPr>
+            <w:tcW w:type="dxa" w:w="3600"/>
+            <w:tcBorders>
+              <w:top w:val="single" w:color="CBD5E1" w:sz="4"/>
+              <w:left w:val="single" w:color="CBD5E1" w:sz="4"/>
+              <w:bottom w:val="single" w:color="CBD5E1" w:sz="4"/>
+              <w:right w:val="single" w:color="CBD5E1" w:sz="4"/>
+            </w:tcBorders>
+            <w:shd w:fill="FFFFFF" w:val="clear"/>
+            <w:tcMar>
+              <w:top w:type="dxa" w:w="120"/>
+              <w:left w:type="dxa" w:w="160"/>
+              <w:bottom w:type="dxa" w:w="120"/>
+              <w:right w:type="dxa" w:w="160"/>
+            </w:tcMar>
+          </w:tcPr>
+          <w:p>
+            <w:pPr>
+              <w:spacing w:after="60" w:before="60" w:line="240"/>
+              <w:jc w:val="left"/>
+            </w:pPr>
+            <w:r>
+              <w:rPr>
+                <w:rFonts w:ascii="Calibri" w:cs="Calibri" w:eastAsia="Calibri" w:hAnsi="Calibri"/>
+                <w:b w:val="false"/>
+                <w:bCs w:val="false"/>
+                <w:color w:val="1E293B"/>
+                <w:sz w:val="19"/>
+                <w:szCs w:val="19"/>
+              </w:rPr>
+              <w:t xml:space="preserve">Mô hình học sâu biến đổi từng khối văn bản thành vector không gian đa chiều (1024 token/chiều), bảo toàn trọn vẹn ngữ nghĩa toán học của từ ngữ.</w:t>
+            </w:r>
+          </w:p>
+        </w:tc>
+        <w:tc>
+          <w:tcPr>
+            <w:tcW w:type="dxa" w:w="3026"/>
+            <w:tcBorders>
+              <w:top w:val="single" w:color="CBD5E1" w:sz="4"/>
+              <w:left w:val="single" w:color="CBD5E1" w:sz="4"/>
+              <w:bottom w:val="single" w:color="CBD5E1" w:sz="4"/>
+              <w:right w:val="single" w:color="CBD5E1" w:sz="4"/>
+            </w:tcBorders>
+            <w:shd w:fill="FFFFFF" w:val="clear"/>
+            <w:tcMar>
+              <w:top w:type="dxa" w:w="120"/>
+              <w:left w:type="dxa" w:w="160"/>
+              <w:bottom w:type="dxa" w:w="120"/>
+              <w:right w:type="dxa" w:w="160"/>
+            </w:tcMar>
+          </w:tcPr>
+          <w:p>
+            <w:pPr>
+              <w:spacing w:after="60" w:before="60" w:line="240"/>
+              <w:jc w:val="left"/>
+            </w:pPr>
+            <w:r>
+              <w:rPr>
+                <w:rFonts w:ascii="Calibri" w:cs="Calibri" w:eastAsia="Calibri" w:hAnsi="Calibri"/>
+                <w:b w:val="false"/>
+                <w:bCs w:val="false"/>
+                <w:color w:val="1E293B"/>
+                <w:sz w:val="19"/>
+                <w:szCs w:val="19"/>
+              </w:rPr>
+              <w:t xml:space="preserve">Cloudflare Workers AI (</w:t>
+            </w:r>
+            <w:r>
+              <w:rPr>
+                <w:rFonts w:ascii="Consolas" w:cs="Consolas" w:eastAsia="Consolas" w:hAnsi="Consolas"/>
+                <w:b/>
+                <w:bCs/>
+                <w:color w:val="0369A1"/>
+                <w:sz w:val="18"/>
+                <w:szCs w:val="18"/>
+                <w:shd w:fill="F1F5F9" w:val="clear"/>
+              </w:rPr>
+              <w:t xml:space="preserve">@cf/baai/bge-base-en-v1.5</w:t>
+            </w:r>
+            <w:r>
+              <w:rPr>
+                <w:rFonts w:ascii="Calibri" w:cs="Calibri" w:eastAsia="Calibri" w:hAnsi="Calibri"/>
+                <w:b w:val="false"/>
+                <w:bCs w:val="false"/>
+                <w:color w:val="1E293B"/>
+                <w:sz w:val="19"/>
+                <w:szCs w:val="19"/>
+              </w:rPr>
+              <w:t xml:space="preserve">) / Google Text Embedding.</w:t>
+            </w:r>
+          </w:p>
+        </w:tc>
+      </w:tr>
+      <w:tr>
+        <w:trPr>
+          <w:cantSplit w:val="off"/>
+        </w:trPr>
+        <w:tc>
+          <w:tcPr>
+            <w:tcW w:type="dxa" w:w="2400"/>
+            <w:tcBorders>
+              <w:top w:val="single" w:color="CBD5E1" w:sz="4"/>
+              <w:left w:val="single" w:color="CBD5E1" w:sz="4"/>
+              <w:bottom w:val="single" w:color="CBD5E1" w:sz="4"/>
+              <w:right w:val="single" w:color="CBD5E1" w:sz="4"/>
+            </w:tcBorders>
+            <w:shd w:fill="F8FAFC" w:val="clear"/>
+            <w:tcMar>
+              <w:top w:type="dxa" w:w="120"/>
+              <w:left w:type="dxa" w:w="160"/>
+              <w:bottom w:type="dxa" w:w="120"/>
+              <w:right w:type="dxa" w:w="160"/>
+            </w:tcMar>
+          </w:tcPr>
+          <w:p>
+            <w:pPr>
+              <w:spacing w:after="60" w:before="60" w:line="240"/>
+              <w:jc w:val="left"/>
+            </w:pPr>
+            <w:r>
+              <w:rPr>
+                <w:rFonts w:ascii="Calibri" w:cs="Calibri" w:eastAsia="Calibri" w:hAnsi="Calibri"/>
+                <w:b/>
+                <w:bCs/>
+                <w:color w:val="1E293B"/>
+                <w:sz w:val="19"/>
+                <w:szCs w:val="19"/>
+              </w:rPr>
+              <w:t xml:space="preserve">② DB Vector (Vector Database)</w:t>
+            </w:r>
+          </w:p>
+        </w:tc>
+        <w:tc>
+          <w:tcPr>
+            <w:tcW w:type="dxa" w:w="3600"/>
+            <w:tcBorders>
+              <w:top w:val="single" w:color="CBD5E1" w:sz="4"/>
+              <w:left w:val="single" w:color="CBD5E1" w:sz="4"/>
+              <w:bottom w:val="single" w:color="CBD5E1" w:sz="4"/>
+              <w:right w:val="single" w:color="CBD5E1" w:sz="4"/>
+            </w:tcBorders>
+            <w:shd w:fill="F8FAFC" w:val="clear"/>
+            <w:tcMar>
+              <w:top w:type="dxa" w:w="120"/>
+              <w:left w:type="dxa" w:w="160"/>
+              <w:bottom w:type="dxa" w:w="120"/>
+              <w:right w:type="dxa" w:w="160"/>
+            </w:tcMar>
+          </w:tcPr>
+          <w:p>
+            <w:pPr>
+              <w:spacing w:after="60" w:before="60" w:line="240"/>
+              <w:jc w:val="left"/>
+            </w:pPr>
+            <w:r>
+              <w:rPr>
+                <w:rFonts w:ascii="Calibri" w:cs="Calibri" w:eastAsia="Calibri" w:hAnsi="Calibri"/>
+                <w:b w:val="false"/>
+                <w:bCs w:val="false"/>
+                <w:color w:val="1E293B"/>
+                <w:sz w:val="19"/>
+                <w:szCs w:val="19"/>
+              </w:rPr>
+              <w:t xml:space="preserve">Cơ sở dữ liệu chuyên biệt lưu trữ vector và đánh chỉ mục theo không gian đa chiều. Khi nhận vector truy vấn, hệ thống tính toán độ tương đồng góc Cosine (</w:t>
+            </w:r>
+            <w:r>
+              <w:rPr>
+                <w:rFonts w:ascii="Consolas" w:cs="Consolas" w:eastAsia="Consolas" w:hAnsi="Consolas"/>
+                <w:b/>
+                <w:bCs/>
+                <w:color w:val="0369A1"/>
+                <w:sz w:val="18"/>
+                <w:szCs w:val="18"/>
+                <w:shd w:fill="F1F5F9" w:val="clear"/>
+              </w:rPr>
+              <w:t xml:space="preserve">Cosine Similarity</w:t>
+            </w:r>
+            <w:r>
+              <w:rPr>
+                <w:rFonts w:ascii="Calibri" w:cs="Calibri" w:eastAsia="Calibri" w:hAnsi="Calibri"/>
+                <w:b w:val="false"/>
+                <w:bCs w:val="false"/>
+                <w:color w:val="1E293B"/>
+                <w:sz w:val="19"/>
+                <w:szCs w:val="19"/>
+              </w:rPr>
+              <w:t xml:space="preserve">) để trích xuất ngay lập tức </w:t>
+            </w:r>
+            <w:r>
+              <w:rPr>
+                <w:rFonts w:ascii="Consolas" w:cs="Consolas" w:eastAsia="Consolas" w:hAnsi="Consolas"/>
+                <w:b/>
+                <w:bCs/>
+                <w:color w:val="0369A1"/>
+                <w:sz w:val="18"/>
+                <w:szCs w:val="18"/>
+                <w:shd w:fill="F1F5F9" w:val="clear"/>
+              </w:rPr>
+              <w:t xml:space="preserve">K phần tử</w:t>
+            </w:r>
+            <w:r>
+              <w:rPr>
+                <w:rFonts w:ascii="Calibri" w:cs="Calibri" w:eastAsia="Calibri" w:hAnsi="Calibri"/>
+                <w:b w:val="false"/>
+                <w:bCs w:val="false"/>
+                <w:color w:val="1E293B"/>
+                <w:sz w:val="19"/>
+                <w:szCs w:val="19"/>
+              </w:rPr>
+              <w:t xml:space="preserve"> (Top-K) có điểm tương quan cao nhất.</w:t>
+            </w:r>
+          </w:p>
+        </w:tc>
+        <w:tc>
+          <w:tcPr>
+            <w:tcW w:type="dxa" w:w="3026"/>
+            <w:tcBorders>
+              <w:top w:val="single" w:color="CBD5E1" w:sz="4"/>
+              <w:left w:val="single" w:color="CBD5E1" w:sz="4"/>
+              <w:bottom w:val="single" w:color="CBD5E1" w:sz="4"/>
+              <w:right w:val="single" w:color="CBD5E1" w:sz="4"/>
+            </w:tcBorders>
+            <w:shd w:fill="F8FAFC" w:val="clear"/>
+            <w:tcMar>
+              <w:top w:type="dxa" w:w="120"/>
+              <w:left w:type="dxa" w:w="160"/>
+              <w:bottom w:type="dxa" w:w="120"/>
+              <w:right w:type="dxa" w:w="160"/>
+            </w:tcMar>
+          </w:tcPr>
+          <w:p>
+            <w:pPr>
+              <w:spacing w:after="60" w:before="60" w:line="240"/>
+              <w:jc w:val="left"/>
+            </w:pPr>
+            <w:r>
+              <w:rPr>
+                <w:rFonts w:ascii="Calibri" w:cs="Calibri" w:eastAsia="Calibri" w:hAnsi="Calibri"/>
+                <w:b/>
+                <w:bCs/>
+                <w:color w:val="1E293B"/>
+                <w:sz w:val="19"/>
+                <w:szCs w:val="19"/>
+              </w:rPr>
+              <w:t xml:space="preserve">Cloudflare Vectorize</w:t>
+            </w:r>
+            <w:r>
+              <w:rPr>
+                <w:rFonts w:ascii="Calibri" w:cs="Calibri" w:eastAsia="Calibri" w:hAnsi="Calibri"/>
+                <w:b w:val="false"/>
+                <w:bCs w:val="false"/>
+                <w:color w:val="1E293B"/>
+                <w:sz w:val="19"/>
+                <w:szCs w:val="19"/>
+              </w:rPr>
+              <w:t xml:space="preserve"> (Edge Native, tích hợp trực tiếp với Workers).</w:t>
+            </w:r>
+          </w:p>
+        </w:tc>
+      </w:tr>
+      <w:tr>
+        <w:trPr>
+          <w:cantSplit w:val="off"/>
+        </w:trPr>
+        <w:tc>
+          <w:tcPr>
+            <w:tcW w:type="dxa" w:w="2400"/>
+            <w:tcBorders>
+              <w:top w:val="single" w:color="CBD5E1" w:sz="4"/>
+              <w:left w:val="single" w:color="CBD5E1" w:sz="4"/>
+              <w:bottom w:val="single" w:color="CBD5E1" w:sz="4"/>
+              <w:right w:val="single" w:color="CBD5E1" w:sz="4"/>
+            </w:tcBorders>
+            <w:shd w:fill="FFFFFF" w:val="clear"/>
+            <w:tcMar>
+              <w:top w:type="dxa" w:w="120"/>
+              <w:left w:type="dxa" w:w="160"/>
+              <w:bottom w:type="dxa" w:w="120"/>
+              <w:right w:type="dxa" w:w="160"/>
+            </w:tcMar>
+          </w:tcPr>
+          <w:p>
+            <w:pPr>
+              <w:spacing w:after="60" w:before="60" w:line="240"/>
+              <w:jc w:val="left"/>
+            </w:pPr>
+            <w:r>
+              <w:rPr>
+                <w:rFonts w:ascii="Calibri" w:cs="Calibri" w:eastAsia="Calibri" w:hAnsi="Calibri"/>
+                <w:b/>
+                <w:bCs/>
+                <w:color w:val="1E293B"/>
+                <w:sz w:val="19"/>
+                <w:szCs w:val="19"/>
+              </w:rPr>
+              <w:t xml:space="preserve">③ LLM (Mô hình Ngôn ngữ)</w:t>
+            </w:r>
+          </w:p>
+        </w:tc>
+        <w:tc>
+          <w:tcPr>
+            <w:tcW w:type="dxa" w:w="3600"/>
+            <w:tcBorders>
+              <w:top w:val="single" w:color="CBD5E1" w:sz="4"/>
+              <w:left w:val="single" w:color="CBD5E1" w:sz="4"/>
+              <w:bottom w:val="single" w:color="CBD5E1" w:sz="4"/>
+              <w:right w:val="single" w:color="CBD5E1" w:sz="4"/>
+            </w:tcBorders>
+            <w:shd w:fill="FFFFFF" w:val="clear"/>
+            <w:tcMar>
+              <w:top w:type="dxa" w:w="120"/>
+              <w:left w:type="dxa" w:w="160"/>
+              <w:bottom w:type="dxa" w:w="120"/>
+              <w:right w:type="dxa" w:w="160"/>
+            </w:tcMar>
+          </w:tcPr>
+          <w:p>
+            <w:pPr>
+              <w:spacing w:after="60" w:before="60" w:line="240"/>
+              <w:jc w:val="left"/>
+            </w:pPr>
+            <w:r>
+              <w:rPr>
+                <w:rFonts w:ascii="Calibri" w:cs="Calibri" w:eastAsia="Calibri" w:hAnsi="Calibri"/>
+                <w:b w:val="false"/>
+                <w:bCs w:val="false"/>
+                <w:color w:val="1E293B"/>
+                <w:sz w:val="19"/>
+                <w:szCs w:val="19"/>
+              </w:rPr>
+              <w:t xml:space="preserve">Tiếp nhận </w:t>
+            </w:r>
+            <w:r>
+              <w:rPr>
+                <w:rFonts w:ascii="Consolas" w:cs="Consolas" w:eastAsia="Consolas" w:hAnsi="Consolas"/>
+                <w:b/>
+                <w:bCs/>
+                <w:color w:val="0369A1"/>
+                <w:sz w:val="18"/>
+                <w:szCs w:val="18"/>
+                <w:shd w:fill="F1F5F9" w:val="clear"/>
+              </w:rPr>
+              <w:t xml:space="preserve">Augmented Prompt</w:t>
+            </w:r>
+            <w:r>
+              <w:rPr>
+                <w:rFonts w:ascii="Calibri" w:cs="Calibri" w:eastAsia="Calibri" w:hAnsi="Calibri"/>
+                <w:b w:val="false"/>
+                <w:bCs w:val="false"/>
+                <w:color w:val="1E293B"/>
+                <w:sz w:val="19"/>
+                <w:szCs w:val="19"/>
+              </w:rPr>
+              <w:t xml:space="preserve"> bao gồm </w:t>
+            </w:r>
+            <w:r>
+              <w:rPr>
+                <w:rFonts w:ascii="Calibri" w:cs="Calibri" w:eastAsia="Calibri" w:hAnsi="Calibri"/>
+                <w:i/>
+                <w:iCs/>
+                <w:color w:val="1E3A8A"/>
+                <w:sz w:val="19"/>
+                <w:szCs w:val="19"/>
+              </w:rPr>
+              <w:t xml:space="preserve">K</w:t>
+            </w:r>
+            <w:r>
+              <w:rPr>
+                <w:rFonts w:ascii="Calibri" w:cs="Calibri" w:eastAsia="Calibri" w:hAnsi="Calibri"/>
+                <w:b w:val="false"/>
+                <w:bCs w:val="false"/>
+                <w:color w:val="1E293B"/>
+                <w:sz w:val="19"/>
+                <w:szCs w:val="19"/>
+              </w:rPr>
+              <w:t xml:space="preserve"> đoạn văn bản thật được truy xuất và câu hỏi gốc của khách hàng. LLM chỉ đóng vai trò hành văn, diễn giải mạch lạc và lịch thiệp, bị khóa chặt bởi luật "Không được bịa đặt".</w:t>
+            </w:r>
+          </w:p>
+        </w:tc>
+        <w:tc>
+          <w:tcPr>
+            <w:tcW w:type="dxa" w:w="3026"/>
+            <w:tcBorders>
+              <w:top w:val="single" w:color="CBD5E1" w:sz="4"/>
+              <w:left w:val="single" w:color="CBD5E1" w:sz="4"/>
+              <w:bottom w:val="single" w:color="CBD5E1" w:sz="4"/>
+              <w:right w:val="single" w:color="CBD5E1" w:sz="4"/>
+            </w:tcBorders>
+            <w:shd w:fill="FFFFFF" w:val="clear"/>
+            <w:tcMar>
+              <w:top w:type="dxa" w:w="120"/>
+              <w:left w:type="dxa" w:w="160"/>
+              <w:bottom w:type="dxa" w:w="120"/>
+              <w:right w:type="dxa" w:w="160"/>
+            </w:tcMar>
+          </w:tcPr>
+          <w:p>
+            <w:pPr>
+              <w:spacing w:after="60" w:before="60" w:line="240"/>
+              <w:jc w:val="left"/>
+            </w:pPr>
+            <w:r>
+              <w:rPr>
+                <w:rFonts w:ascii="Calibri" w:cs="Calibri" w:eastAsia="Calibri" w:hAnsi="Calibri"/>
+                <w:b/>
+                <w:bCs/>
+                <w:color w:val="1E293B"/>
+                <w:sz w:val="19"/>
+                <w:szCs w:val="19"/>
+              </w:rPr>
+              <w:t xml:space="preserve">Google Gemini 2.5 Flash</w:t>
+            </w:r>
+            <w:r>
+              <w:rPr>
+                <w:rFonts w:ascii="Calibri" w:cs="Calibri" w:eastAsia="Calibri" w:hAnsi="Calibri"/>
+                <w:b w:val="false"/>
+                <w:bCs w:val="false"/>
+                <w:color w:val="1E293B"/>
+                <w:sz w:val="19"/>
+                <w:szCs w:val="19"/>
+              </w:rPr>
+              <w:t xml:space="preserve"> qua REST API / Cloudflare Workers AI.</w:t>
+            </w:r>
+          </w:p>
+        </w:tc>
+      </w:tr>
+    </w:tbl>
+    <w:p>
+      <w:pPr>
+        <w:spacing w:after="160" w:before="0"/>
+      </w:pPr>
+    </w:p>
+    <w:p>
+      <w:pPr>
+        <w:pStyle w:val="Heading3"/>
+        <w:spacing w:after="80" w:before="200"/>
+      </w:pPr>
+      <w:r>
+        <w:rPr>
+          <w:rFonts w:ascii="Calibri" w:cs="Calibri" w:eastAsia="Calibri" w:hAnsi="Calibri"/>
+          <w:b/>
+          <w:bCs/>
+          <w:color w:val="0F172A"/>
+          <w:sz w:val="23"/>
+          <w:szCs w:val="23"/>
+        </w:rPr>
+        <w:t xml:space="preserve">1.4.4 Prompt Engineering Chống Bịa Đặt (System Grounding)</w:t>
+      </w:r>
+    </w:p>
+    <w:p>
+      <w:pPr>
+        <w:spacing w:after="120" w:before="60" w:line="276"/>
+        <w:jc w:val="both"/>
+      </w:pPr>
+      <w:r>
+        <w:rPr>
+          <w:rFonts w:ascii="Calibri" w:cs="Calibri" w:eastAsia="Calibri" w:hAnsi="Calibri"/>
+          <w:color w:val="1E293B"/>
+          <w:sz w:val="22"/>
+          <w:szCs w:val="22"/>
+        </w:rPr>
+        <w:t xml:space="preserve">Để bảo đảm chatbot luôn tuân thủ nguyên tắc "Không được bịa - Chỉ sử dụng dữ liệu hiện có", máy chủ nhúng chỉ thị hệ thống nghiêm ngặt vào mỗi phiên hội thoại:</w:t>
+      </w:r>
+    </w:p>
+    <w:p>
+      <w:pPr>
+        <w:pBdr>
+          <w:left w:val="single" w:color="3B82F6" w:sz="18" w:space="10"/>
+        </w:pBdr>
+        <w:shd w:fill="F1F5F9" w:val="clear"/>
+        <w:spacing w:after="0" w:before="80" w:line="220"/>
+        <w:ind w:left="240"/>
+      </w:pPr>
+      <w:r>
+        <w:rPr>
+          <w:rFonts w:ascii="Consolas" w:cs="Consolas" w:eastAsia="Consolas" w:hAnsi="Consolas"/>
+          <w:color w:val="0F172A"/>
+          <w:sz w:val="18"/>
+          <w:szCs w:val="18"/>
+        </w:rPr>
+        <w:t xml:space="preserve">[VAI TRÒ]: Bạn là Trợ lý du lịch ảo Concierge độc quyền của khu nghỉ dưỡng cao cấp AURA STAY.</w:t>
+      </w:r>
+    </w:p>
+    <w:p>
+      <w:pPr>
+        <w:pBdr>
+          <w:left w:val="single" w:color="3B82F6" w:sz="18" w:space="10"/>
+        </w:pBdr>
+        <w:shd w:fill="F1F5F9" w:val="clear"/>
+        <w:spacing w:after="0" w:before="0" w:line="220"/>
+        <w:ind w:left="240"/>
+      </w:pPr>
+      <w:r>
+        <w:rPr>
+          <w:rFonts w:ascii="Consolas" w:cs="Consolas" w:eastAsia="Consolas" w:hAnsi="Consolas"/>
+          <w:color w:val="0F172A"/>
+          <w:sz w:val="18"/>
+          <w:szCs w:val="18"/>
+        </w:rPr>
+        <w:t xml:space="preserve">[NGUYÊN TẮC BẮT BUỘC]:</w:t>
+      </w:r>
+    </w:p>
+    <w:p>
+      <w:pPr>
+        <w:pBdr>
+          <w:left w:val="single" w:color="3B82F6" w:sz="18" w:space="10"/>
+        </w:pBdr>
+        <w:shd w:fill="F1F5F9" w:val="clear"/>
+        <w:spacing w:after="0" w:before="0" w:line="220"/>
+        <w:ind w:left="240"/>
+      </w:pPr>
+      <w:r>
+        <w:rPr>
+          <w:rFonts w:ascii="Consolas" w:cs="Consolas" w:eastAsia="Consolas" w:hAnsi="Consolas"/>
+          <w:color w:val="0F172A"/>
+          <w:sz w:val="18"/>
+          <w:szCs w:val="18"/>
+        </w:rPr>
+        <w:t xml:space="preserve">1. CHỈ ĐƯỢC PHÉP trả lời dựa trên [DỮ LIỆU NỘI BỘ] đã được trích xuất dưới đây.</w:t>
+      </w:r>
+    </w:p>
+    <w:p>
+      <w:pPr>
+        <w:pBdr>
+          <w:left w:val="single" w:color="3B82F6" w:sz="18" w:space="10"/>
+        </w:pBdr>
+        <w:shd w:fill="F1F5F9" w:val="clear"/>
+        <w:spacing w:after="0" w:before="0" w:line="220"/>
+        <w:ind w:left="240"/>
+      </w:pPr>
+      <w:r>
+        <w:rPr>
+          <w:rFonts w:ascii="Consolas" w:cs="Consolas" w:eastAsia="Consolas" w:hAnsi="Consolas"/>
+          <w:color w:val="0F172A"/>
+          <w:sz w:val="18"/>
+          <w:szCs w:val="18"/>
+        </w:rPr>
+        <w:t xml:space="preserve">2. TUYỆT ĐỐI KHÔNG ĐƯỢC BỊA ĐẶT, suy diễn giá cả, dịch vụ hoặc tiện ích ngoài tài liệu.</w:t>
+      </w:r>
+    </w:p>
+    <w:p>
+      <w:pPr>
+        <w:pBdr>
+          <w:left w:val="single" w:color="3B82F6" w:sz="18" w:space="10"/>
+        </w:pBdr>
+        <w:shd w:fill="F1F5F9" w:val="clear"/>
+        <w:spacing w:after="0" w:before="0" w:line="220"/>
+        <w:ind w:left="240"/>
+      </w:pPr>
+      <w:r>
+        <w:rPr>
+          <w:rFonts w:ascii="Consolas" w:cs="Consolas" w:eastAsia="Consolas" w:hAnsi="Consolas"/>
+          <w:color w:val="0F172A"/>
+          <w:sz w:val="18"/>
+          <w:szCs w:val="18"/>
+        </w:rPr>
+        <w:t xml:space="preserve">3. Nếu [DỮ LIỆU NỘI BỘ] không có câu trả lời, hãy lịch sự từ chối:</w:t>
+      </w:r>
+    </w:p>
+    <w:p>
+      <w:pPr>
+        <w:pBdr>
+          <w:left w:val="single" w:color="3B82F6" w:sz="18" w:space="10"/>
+        </w:pBdr>
+        <w:shd w:fill="F1F5F9" w:val="clear"/>
+        <w:spacing w:after="0" w:before="0" w:line="220"/>
+        <w:ind w:left="240"/>
+      </w:pPr>
+      <w:r>
+        <w:rPr>
+          <w:rFonts w:ascii="Consolas" w:cs="Consolas" w:eastAsia="Consolas" w:hAnsi="Consolas"/>
+          <w:color w:val="0F172A"/>
+          <w:sz w:val="18"/>
+          <w:szCs w:val="18"/>
+        </w:rPr>
+        <w:t xml:space="preserve">   "Dạ hiện tại em chưa có thông tin chính thức về vấn đề này. Quý khách vui lòng liên hệ hotline lễ tân 0988.xxx.xxx để được hỗ trợ chu đáo nhất ạ."</w:t>
+      </w:r>
+    </w:p>
+    <w:p>
+      <w:pPr>
+        <w:pBdr>
+          <w:left w:val="single" w:color="3B82F6" w:sz="18" w:space="10"/>
+        </w:pBdr>
+        <w:shd w:fill="F1F5F9" w:val="clear"/>
+        <w:spacing w:after="0" w:before="0" w:line="220"/>
+        <w:ind w:left="240"/>
+      </w:pPr>
+      <w:r>
+        <w:rPr>
+          <w:rFonts w:ascii="Consolas" w:cs="Consolas" w:eastAsia="Consolas" w:hAnsi="Consolas"/>
+          <w:color w:val="0F172A"/>
+          <w:sz w:val="18"/>
+          <w:szCs w:val="18"/>
+        </w:rPr>
+        <w:t xml:space="preserve"> </w:t>
+      </w:r>
+    </w:p>
+    <w:p>
+      <w:pPr>
+        <w:pBdr>
+          <w:left w:val="single" w:color="3B82F6" w:sz="18" w:space="10"/>
+        </w:pBdr>
+        <w:shd w:fill="F1F5F9" w:val="clear"/>
+        <w:spacing w:after="0" w:before="0" w:line="220"/>
+        <w:ind w:left="240"/>
+      </w:pPr>
+      <w:r>
+        <w:rPr>
+          <w:rFonts w:ascii="Consolas" w:cs="Consolas" w:eastAsia="Consolas" w:hAnsi="Consolas"/>
+          <w:color w:val="0F172A"/>
+          <w:sz w:val="18"/>
+          <w:szCs w:val="18"/>
+        </w:rPr>
+        <w:t xml:space="preserve">[DỮ LIỆU NỘI BỘ ĐÃ TRUY XUẤT]:</w:t>
+      </w:r>
+    </w:p>
+    <w:p>
+      <w:pPr>
+        <w:pBdr>
+          <w:left w:val="single" w:color="3B82F6" w:sz="18" w:space="10"/>
+        </w:pBdr>
+        <w:shd w:fill="F1F5F9" w:val="clear"/>
+        <w:spacing w:after="0" w:before="0" w:line="220"/>
+        <w:ind w:left="240"/>
+      </w:pPr>
+      <w:r>
+        <w:rPr>
+          <w:rFonts w:ascii="Consolas" w:cs="Consolas" w:eastAsia="Consolas" w:hAnsi="Consolas"/>
+          <w:color w:val="0F172A"/>
+          <w:sz w:val="18"/>
+          <w:szCs w:val="18"/>
+        </w:rPr>
+        <w:t xml:space="preserve">{Top-K Chunks từ Cloudflare Vectorize}</w:t>
+      </w:r>
+    </w:p>
+    <w:p>
+      <w:pPr>
+        <w:pBdr>
+          <w:left w:val="single" w:color="3B82F6" w:sz="18" w:space="10"/>
+        </w:pBdr>
+        <w:shd w:fill="F1F5F9" w:val="clear"/>
+        <w:spacing w:after="0" w:before="0" w:line="220"/>
+        <w:ind w:left="240"/>
+      </w:pPr>
+      <w:r>
+        <w:rPr>
+          <w:rFonts w:ascii="Consolas" w:cs="Consolas" w:eastAsia="Consolas" w:hAnsi="Consolas"/>
+          <w:color w:val="0F172A"/>
+          <w:sz w:val="18"/>
+          <w:szCs w:val="18"/>
+        </w:rPr>
+        <w:t xml:space="preserve"> </w:t>
+      </w:r>
+    </w:p>
+    <w:p>
+      <w:pPr>
+        <w:pBdr>
+          <w:left w:val="single" w:color="3B82F6" w:sz="18" w:space="10"/>
+        </w:pBdr>
+        <w:shd w:fill="F1F5F9" w:val="clear"/>
+        <w:spacing w:after="0" w:before="0" w:line="220"/>
+        <w:ind w:left="240"/>
+      </w:pPr>
+      <w:r>
+        <w:rPr>
+          <w:rFonts w:ascii="Consolas" w:cs="Consolas" w:eastAsia="Consolas" w:hAnsi="Consolas"/>
+          <w:color w:val="0F172A"/>
+          <w:sz w:val="18"/>
+          <w:szCs w:val="18"/>
+        </w:rPr>
+        <w:t xml:space="preserve">[CÂU HỎI CỦA KHÁCH HÀNG]:</w:t>
+      </w:r>
+    </w:p>
+    <w:p>
+      <w:pPr>
+        <w:pBdr>
+          <w:left w:val="single" w:color="3B82F6" w:sz="18" w:space="10"/>
+        </w:pBdr>
+        <w:shd w:fill="F1F5F9" w:val="clear"/>
+        <w:spacing w:after="80" w:before="0" w:line="220"/>
+        <w:ind w:left="240"/>
+      </w:pPr>
+      <w:r>
+        <w:rPr>
+          <w:rFonts w:ascii="Consolas" w:cs="Consolas" w:eastAsia="Consolas" w:hAnsi="Consolas"/>
+          <w:color w:val="0F172A"/>
+          <w:sz w:val="18"/>
+          <w:szCs w:val="18"/>
+        </w:rPr>
+        <w:t xml:space="preserve">{User Query}</w:t>
+      </w:r>
+    </w:p>
+    <w:p>
+      <w:pPr>
+        <w:spacing w:after="140" w:before="0"/>
       </w:pPr>
     </w:p>
     <w:p>

</xml_diff>